<commit_message>
changed format of output
max theoretical calculation in brackets
</commit_message>
<xml_diff>
--- a/Praktikum/V02/Bericht_Praktikum_mINF4-1_V02.docx
+++ b/Praktikum/V02/Bericht_Praktikum_mINF4-1_V02.docx
@@ -338,19 +338,7 @@
           <w:rPr>
             <w:rFonts w:ascii="Cambria Math" w:eastAsiaTheme="minorEastAsia" w:hAnsi="Cambria Math"/>
           </w:rPr>
-          <m:t>n</m:t>
-        </m:r>
-        <m:r>
-          <w:rPr>
-            <w:rFonts w:ascii="Cambria Math" w:eastAsiaTheme="minorEastAsia" w:hAnsi="Cambria Math"/>
-          </w:rPr>
-          <m:t>-</m:t>
-        </m:r>
-        <m:r>
-          <w:rPr>
-            <w:rFonts w:ascii="Cambria Math" w:eastAsiaTheme="minorEastAsia" w:hAnsi="Cambria Math"/>
-          </w:rPr>
-          <m:t>1</m:t>
+          <m:t>n-1</m:t>
         </m:r>
       </m:oMath>
     </w:p>
@@ -419,13 +407,7 @@
               <w:rPr>
                 <w:rFonts w:ascii="Cambria Math" w:eastAsiaTheme="minorEastAsia" w:hAnsi="Cambria Math"/>
               </w:rPr>
-              <m:t>-</m:t>
-            </m:r>
-            <m:r>
-              <w:rPr>
-                <w:rFonts w:ascii="Cambria Math" w:eastAsiaTheme="minorEastAsia" w:hAnsi="Cambria Math"/>
-              </w:rPr>
-              <m:t>1</m:t>
+              <m:t>-1</m:t>
             </m:r>
           </m:e>
         </m:d>
@@ -467,13 +449,7 @@
           <w:rPr>
             <w:rFonts w:ascii="Cambria Math" w:eastAsiaTheme="minorEastAsia" w:hAnsi="Cambria Math"/>
           </w:rPr>
-          <m:t>4</m:t>
-        </m:r>
-        <m:r>
-          <w:rPr>
-            <w:rFonts w:ascii="Cambria Math" w:eastAsiaTheme="minorEastAsia" w:hAnsi="Cambria Math"/>
-          </w:rPr>
-          <m:t>∙</m:t>
+          <m:t>4∙</m:t>
         </m:r>
         <m:d>
           <m:dPr>
@@ -515,13 +491,7 @@
               <w:rPr>
                 <w:rFonts w:ascii="Cambria Math" w:eastAsiaTheme="minorEastAsia" w:hAnsi="Cambria Math"/>
               </w:rPr>
-              <m:t>-</m:t>
-            </m:r>
-            <m:r>
-              <w:rPr>
-                <w:rFonts w:ascii="Cambria Math" w:eastAsiaTheme="minorEastAsia" w:hAnsi="Cambria Math"/>
-              </w:rPr>
-              <m:t>1</m:t>
+              <m:t>-1</m:t>
             </m:r>
           </m:e>
         </m:d>
@@ -529,13 +499,7 @@
           <w:rPr>
             <w:rFonts w:ascii="Cambria Math" w:eastAsiaTheme="minorEastAsia" w:hAnsi="Cambria Math"/>
           </w:rPr>
-          <m:t>=n-</m:t>
-        </m:r>
-        <m:r>
-          <w:rPr>
-            <w:rFonts w:ascii="Cambria Math" w:eastAsiaTheme="minorEastAsia" w:hAnsi="Cambria Math"/>
-          </w:rPr>
-          <m:t>4</m:t>
+          <m:t>=n-4</m:t>
         </m:r>
       </m:oMath>
     </w:p>
@@ -644,13 +608,7 @@
               <w:rPr>
                 <w:rFonts w:ascii="Cambria Math" w:eastAsiaTheme="minorEastAsia" w:hAnsi="Cambria Math"/>
               </w:rPr>
-              <m:t>-</m:t>
-            </m:r>
-            <m:r>
-              <w:rPr>
-                <w:rFonts w:ascii="Cambria Math" w:eastAsiaTheme="minorEastAsia" w:hAnsi="Cambria Math"/>
-              </w:rPr>
-              <m:t>1</m:t>
+              <m:t>-1</m:t>
             </m:r>
           </m:e>
         </m:d>
@@ -745,13 +703,7 @@
                 <w:rPr>
                   <w:rFonts w:ascii="Cambria Math" w:eastAsiaTheme="minorEastAsia" w:hAnsi="Cambria Math"/>
                 </w:rPr>
-                <m:t>k=</m:t>
-              </m:r>
-              <m:r>
-                <w:rPr>
-                  <w:rFonts w:ascii="Cambria Math" w:eastAsiaTheme="minorEastAsia" w:hAnsi="Cambria Math"/>
-                </w:rPr>
-                <m:t>0</m:t>
+                <m:t>k=0</m:t>
               </m:r>
             </m:sub>
             <m:sup>
@@ -807,19 +759,7 @@
                 <w:rPr>
                   <w:rFonts w:ascii="Cambria Math" w:eastAsiaTheme="minorEastAsia" w:hAnsi="Cambria Math"/>
                 </w:rPr>
-                <m:t>(</m:t>
-              </m:r>
-              <m:r>
-                <w:rPr>
-                  <w:rFonts w:ascii="Cambria Math" w:eastAsiaTheme="minorEastAsia" w:hAnsi="Cambria Math"/>
-                </w:rPr>
-                <m:t>n</m:t>
-              </m:r>
-              <m:r>
-                <w:rPr>
-                  <w:rFonts w:ascii="Cambria Math" w:eastAsiaTheme="minorEastAsia" w:hAnsi="Cambria Math"/>
-                </w:rPr>
-                <m:t>-</m:t>
+                <m:t>(n-</m:t>
               </m:r>
               <m:sSup>
                 <m:sSupPr>
@@ -894,13 +834,7 @@
                 <w:rPr>
                   <w:rFonts w:ascii="Cambria Math" w:eastAsiaTheme="minorEastAsia" w:hAnsi="Cambria Math"/>
                 </w:rPr>
-                <m:t>k=</m:t>
-              </m:r>
-              <m:r>
-                <w:rPr>
-                  <w:rFonts w:ascii="Cambria Math" w:eastAsiaTheme="minorEastAsia" w:hAnsi="Cambria Math"/>
-                </w:rPr>
-                <m:t>1</m:t>
+                <m:t>k=1</m:t>
               </m:r>
             </m:sub>
             <m:sup>
@@ -966,13 +900,7 @@
                     <w:rPr>
                       <w:rFonts w:ascii="Cambria Math" w:eastAsiaTheme="minorEastAsia" w:hAnsi="Cambria Math"/>
                     </w:rPr>
-                    <m:t>n</m:t>
-                  </m:r>
-                  <m:r>
-                    <w:rPr>
-                      <w:rFonts w:ascii="Cambria Math" w:eastAsiaTheme="minorEastAsia" w:hAnsi="Cambria Math"/>
-                    </w:rPr>
-                    <m:t>-</m:t>
+                    <m:t>n-</m:t>
                   </m:r>
                   <m:sSup>
                     <m:sSupPr>
@@ -1048,13 +976,7 @@
                     <w:rPr>
                       <w:rFonts w:ascii="Cambria Math" w:eastAsiaTheme="minorEastAsia" w:hAnsi="Cambria Math"/>
                     </w:rPr>
-                    <m:t>k=</m:t>
-                  </m:r>
-                  <m:r>
-                    <w:rPr>
-                      <w:rFonts w:ascii="Cambria Math" w:eastAsiaTheme="minorEastAsia" w:hAnsi="Cambria Math"/>
-                    </w:rPr>
-                    <m:t>1</m:t>
+                    <m:t>k=1</m:t>
                   </m:r>
                 </m:sub>
                 <m:sup>
@@ -1110,19 +1032,7 @@
                     <w:rPr>
                       <w:rFonts w:ascii="Cambria Math" w:eastAsiaTheme="minorEastAsia" w:hAnsi="Cambria Math"/>
                     </w:rPr>
-                    <m:t>(</m:t>
-                  </m:r>
-                  <m:r>
-                    <w:rPr>
-                      <w:rFonts w:ascii="Cambria Math" w:eastAsiaTheme="minorEastAsia" w:hAnsi="Cambria Math"/>
-                    </w:rPr>
-                    <m:t>n</m:t>
-                  </m:r>
-                  <m:r>
-                    <w:rPr>
-                      <w:rFonts w:ascii="Cambria Math" w:eastAsiaTheme="minorEastAsia" w:hAnsi="Cambria Math"/>
-                    </w:rPr>
-                    <m:t>)</m:t>
+                    <m:t>(n)</m:t>
                   </m:r>
                 </m:e>
               </m:nary>
@@ -1150,13 +1060,7 @@
                 <w:rPr>
                   <w:rFonts w:ascii="Cambria Math" w:eastAsiaTheme="minorEastAsia" w:hAnsi="Cambria Math"/>
                 </w:rPr>
-                <m:t>k=</m:t>
-              </m:r>
-              <m:r>
-                <w:rPr>
-                  <w:rFonts w:ascii="Cambria Math" w:eastAsiaTheme="minorEastAsia" w:hAnsi="Cambria Math"/>
-                </w:rPr>
-                <m:t>1</m:t>
+                <m:t>k=1</m:t>
               </m:r>
             </m:sub>
             <m:sup>
@@ -1252,13 +1156,7 @@
             <w:rPr>
               <w:rFonts w:ascii="Cambria Math" w:eastAsiaTheme="minorEastAsia" w:hAnsi="Cambria Math"/>
             </w:rPr>
-            <m:t>+</m:t>
-          </m:r>
-          <m:r>
-            <w:rPr>
-              <w:rFonts w:ascii="Cambria Math" w:eastAsiaTheme="minorEastAsia" w:hAnsi="Cambria Math"/>
-            </w:rPr>
-            <m:t>n-1</m:t>
+            <m:t>+n-1</m:t>
           </m:r>
         </m:oMath>
       </m:oMathPara>
@@ -1358,13 +1256,7 @@
                     <w:rPr>
                       <w:rFonts w:ascii="Cambria Math" w:eastAsiaTheme="minorEastAsia" w:hAnsi="Cambria Math"/>
                     </w:rPr>
-                    <m:t>k=</m:t>
-                  </m:r>
-                  <m:r>
-                    <w:rPr>
-                      <w:rFonts w:ascii="Cambria Math" w:eastAsiaTheme="minorEastAsia" w:hAnsi="Cambria Math"/>
-                    </w:rPr>
-                    <m:t>0</m:t>
+                    <m:t>k=0</m:t>
                   </m:r>
                 </m:sub>
                 <m:sup>
@@ -1494,13 +1386,7 @@
             <w:rPr>
               <w:rFonts w:ascii="Cambria Math" w:eastAsiaTheme="minorEastAsia" w:hAnsi="Cambria Math"/>
             </w:rPr>
-            <m:t>+</m:t>
-          </m:r>
-          <m:r>
-            <w:rPr>
-              <w:rFonts w:ascii="Cambria Math" w:eastAsiaTheme="minorEastAsia" w:hAnsi="Cambria Math"/>
-            </w:rPr>
-            <m:t>n-1</m:t>
+            <m:t>+n-1</m:t>
           </m:r>
         </m:oMath>
       </m:oMathPara>
@@ -1517,13 +1403,7 @@
             <w:rPr>
               <w:rFonts w:ascii="Cambria Math" w:eastAsiaTheme="minorEastAsia" w:hAnsi="Cambria Math"/>
             </w:rPr>
-            <m:t>=</m:t>
-          </m:r>
-          <m:r>
-            <w:rPr>
-              <w:rFonts w:ascii="Cambria Math" w:eastAsiaTheme="minorEastAsia" w:hAnsi="Cambria Math"/>
-            </w:rPr>
-            <m:t>n∙</m:t>
+            <m:t>=n∙</m:t>
           </m:r>
           <m:func>
             <m:funcPr>
@@ -1691,25 +1571,7 @@
             <w:rPr>
               <w:rFonts w:ascii="Cambria Math" w:eastAsiaTheme="minorEastAsia" w:hAnsi="Cambria Math"/>
             </w:rPr>
-            <m:t>+</m:t>
-          </m:r>
-          <m:r>
-            <w:rPr>
-              <w:rFonts w:ascii="Cambria Math" w:eastAsiaTheme="minorEastAsia" w:hAnsi="Cambria Math"/>
-            </w:rPr>
-            <m:t>1</m:t>
-          </m:r>
-          <m:r>
-            <w:rPr>
-              <w:rFonts w:ascii="Cambria Math" w:eastAsiaTheme="minorEastAsia" w:hAnsi="Cambria Math"/>
-            </w:rPr>
-            <m:t>+n-1</m:t>
-          </m:r>
-          <m:r>
-            <w:rPr>
-              <w:rFonts w:ascii="Cambria Math" w:eastAsiaTheme="minorEastAsia" w:hAnsi="Cambria Math"/>
-            </w:rPr>
-            <m:t>=</m:t>
+            <m:t>+1+n-1=</m:t>
           </m:r>
         </m:oMath>
       </m:oMathPara>
@@ -1726,13 +1588,7 @@
             <w:rPr>
               <w:rFonts w:ascii="Cambria Math" w:eastAsiaTheme="minorEastAsia" w:hAnsi="Cambria Math"/>
             </w:rPr>
-            <m:t>=</m:t>
-          </m:r>
-          <m:r>
-            <w:rPr>
-              <w:rFonts w:ascii="Cambria Math" w:eastAsiaTheme="minorEastAsia" w:hAnsi="Cambria Math"/>
-            </w:rPr>
-            <m:t>n∙</m:t>
+            <m:t>=n∙</m:t>
           </m:r>
           <m:func>
             <m:funcPr>
@@ -1800,13 +1656,7 @@
                 <w:rPr>
                   <w:rFonts w:ascii="Cambria Math" w:eastAsiaTheme="minorEastAsia" w:hAnsi="Cambria Math"/>
                 </w:rPr>
-                <m:t>1-</m:t>
-              </m:r>
-              <m:r>
-                <w:rPr>
-                  <w:rFonts w:ascii="Cambria Math" w:eastAsiaTheme="minorEastAsia" w:hAnsi="Cambria Math"/>
-                </w:rPr>
-                <m:t>2n</m:t>
+                <m:t>1-2n</m:t>
               </m:r>
             </m:num>
             <m:den>
@@ -1822,19 +1672,7 @@
             <w:rPr>
               <w:rFonts w:ascii="Cambria Math" w:eastAsiaTheme="minorEastAsia" w:hAnsi="Cambria Math"/>
             </w:rPr>
-            <m:t>+</m:t>
-          </m:r>
-          <m:r>
-            <w:rPr>
-              <w:rFonts w:ascii="Cambria Math" w:eastAsiaTheme="minorEastAsia" w:hAnsi="Cambria Math"/>
-            </w:rPr>
-            <m:t>1</m:t>
-          </m:r>
-          <m:r>
-            <w:rPr>
-              <w:rFonts w:ascii="Cambria Math" w:eastAsiaTheme="minorEastAsia" w:hAnsi="Cambria Math"/>
-            </w:rPr>
-            <m:t>+n-1=</m:t>
+            <m:t>+1+n-1=</m:t>
           </m:r>
         </m:oMath>
       </m:oMathPara>
@@ -1999,13 +1837,7 @@
           <w:rPr>
             <w:rFonts w:ascii="Cambria Math" w:eastAsiaTheme="minorEastAsia" w:hAnsi="Cambria Math"/>
           </w:rPr>
-          <m:t>O(</m:t>
-        </m:r>
-        <m:r>
-          <w:rPr>
-            <w:rFonts w:ascii="Cambria Math" w:eastAsiaTheme="minorEastAsia" w:hAnsi="Cambria Math"/>
-          </w:rPr>
-          <m:t>n</m:t>
+          <m:t>O(n</m:t>
         </m:r>
         <m:func>
           <m:funcPr>
@@ -2050,8 +1882,14 @@
     <w:p>
       <w:pPr>
         <w:pStyle w:val="berschrift1"/>
-      </w:pPr>
-      <w:r>
+        <w:rPr>
+          <w:lang w:val="en-US"/>
+        </w:rPr>
+      </w:pPr>
+      <w:r>
+        <w:rPr>
+          <w:lang w:val="en-US"/>
+        </w:rPr>
         <w:t>2.</w:t>
       </w:r>
     </w:p>
@@ -2060,15 +1898,34 @@
         <w:rPr>
           <w:i/>
           <w:iCs/>
-        </w:rPr>
-      </w:pPr>
-      <w:r>
-        <w:t xml:space="preserve">Python Skript: </w:t>
+          <w:lang w:val="en-US"/>
+        </w:rPr>
+      </w:pPr>
+      <w:r>
+        <w:rPr>
+          <w:lang w:val="en-US"/>
+        </w:rPr>
+        <w:t xml:space="preserve">Python </w:t>
+      </w:r>
+      <w:proofErr w:type="spellStart"/>
+      <w:r>
+        <w:rPr>
+          <w:lang w:val="en-US"/>
+        </w:rPr>
+        <w:t>Skript</w:t>
+      </w:r>
+      <w:proofErr w:type="spellEnd"/>
+      <w:r>
+        <w:rPr>
+          <w:lang w:val="en-US"/>
+        </w:rPr>
+        <w:t xml:space="preserve">: </w:t>
       </w:r>
       <w:r>
         <w:rPr>
           <w:i/>
           <w:iCs/>
+          <w:lang w:val="en-US"/>
         </w:rPr>
         <w:t>V0</w:t>
       </w:r>
@@ -2076,6 +1933,7 @@
         <w:rPr>
           <w:i/>
           <w:iCs/>
+          <w:lang w:val="en-US"/>
         </w:rPr>
         <w:t>2</w:t>
       </w:r>
@@ -2083,6 +1941,7 @@
         <w:rPr>
           <w:i/>
           <w:iCs/>
+          <w:lang w:val="en-US"/>
         </w:rPr>
         <w:t>.py</w:t>
       </w:r>
@@ -2126,7 +1985,25 @@
           <w:szCs w:val="22"/>
           <w:lang w:val="en-US"/>
         </w:rPr>
-        <w:t>Comparisons: 35, 39 (max)</w:t>
+        <w:t xml:space="preserve">Comparisons: 35 </w:t>
+      </w:r>
+      <w:r>
+        <w:rPr>
+          <w:rFonts w:ascii="Courier New" w:hAnsi="Courier New" w:cs="Courier New"/>
+          <w:sz w:val="22"/>
+          <w:szCs w:val="22"/>
+          <w:lang w:val="en-US"/>
+        </w:rPr>
+        <w:t>(</w:t>
+      </w:r>
+      <w:r>
+        <w:rPr>
+          <w:rFonts w:ascii="Courier New" w:hAnsi="Courier New" w:cs="Courier New"/>
+          <w:sz w:val="22"/>
+          <w:szCs w:val="22"/>
+          <w:lang w:val="en-US"/>
+        </w:rPr>
+        <w:t>39 max)</w:t>
       </w:r>
     </w:p>
     <w:p>
@@ -2233,7 +2110,25 @@
           <w:szCs w:val="22"/>
           <w:lang w:val="en-US"/>
         </w:rPr>
-        <w:t>Comparisons: 535, 564 (max)</w:t>
+        <w:t xml:space="preserve">Comparisons: 535 </w:t>
+      </w:r>
+      <w:r>
+        <w:rPr>
+          <w:rFonts w:ascii="Courier New" w:hAnsi="Courier New" w:cs="Courier New"/>
+          <w:sz w:val="22"/>
+          <w:szCs w:val="22"/>
+          <w:lang w:val="en-US"/>
+        </w:rPr>
+        <w:t>(</w:t>
+      </w:r>
+      <w:r>
+        <w:rPr>
+          <w:rFonts w:ascii="Courier New" w:hAnsi="Courier New" w:cs="Courier New"/>
+          <w:sz w:val="22"/>
+          <w:szCs w:val="22"/>
+          <w:lang w:val="en-US"/>
+        </w:rPr>
+        <w:t>564 max)</w:t>
       </w:r>
     </w:p>
     <w:p>
@@ -2340,7 +2235,25 @@
           <w:szCs w:val="22"/>
           <w:lang w:val="en-US"/>
         </w:rPr>
-        <w:t>Comparisons: 8707, 8965 (max)</w:t>
+        <w:t xml:space="preserve">Comparisons: 8707 </w:t>
+      </w:r>
+      <w:r>
+        <w:rPr>
+          <w:rFonts w:ascii="Courier New" w:hAnsi="Courier New" w:cs="Courier New"/>
+          <w:sz w:val="22"/>
+          <w:szCs w:val="22"/>
+          <w:lang w:val="en-US"/>
+        </w:rPr>
+        <w:t>(</w:t>
+      </w:r>
+      <w:r>
+        <w:rPr>
+          <w:rFonts w:ascii="Courier New" w:hAnsi="Courier New" w:cs="Courier New"/>
+          <w:sz w:val="22"/>
+          <w:szCs w:val="22"/>
+          <w:lang w:val="en-US"/>
+        </w:rPr>
+        <w:t>8965 max)</w:t>
       </w:r>
     </w:p>
     <w:p>
@@ -2447,7 +2360,25 @@
           <w:szCs w:val="22"/>
           <w:lang w:val="en-US"/>
         </w:rPr>
-        <w:t>Comparisons: 120400, 122877 (max)</w:t>
+        <w:t xml:space="preserve">Comparisons: 120400 </w:t>
+      </w:r>
+      <w:r>
+        <w:rPr>
+          <w:rFonts w:ascii="Courier New" w:hAnsi="Courier New" w:cs="Courier New"/>
+          <w:sz w:val="22"/>
+          <w:szCs w:val="22"/>
+          <w:lang w:val="en-US"/>
+        </w:rPr>
+        <w:t>(</w:t>
+      </w:r>
+      <w:r>
+        <w:rPr>
+          <w:rFonts w:ascii="Courier New" w:hAnsi="Courier New" w:cs="Courier New"/>
+          <w:sz w:val="22"/>
+          <w:szCs w:val="22"/>
+          <w:lang w:val="en-US"/>
+        </w:rPr>
+        <w:t>122877 max)</w:t>
       </w:r>
     </w:p>
     <w:p>
@@ -2458,17 +2389,43 @@
           <w:rFonts w:ascii="Courier New" w:hAnsi="Courier New" w:cs="Courier New"/>
           <w:sz w:val="22"/>
           <w:szCs w:val="22"/>
-          <w:lang w:val="en-US"/>
-        </w:rPr>
-      </w:pPr>
-      <w:r>
-        <w:rPr>
-          <w:rFonts w:ascii="Courier New" w:hAnsi="Courier New" w:cs="Courier New"/>
-          <w:sz w:val="22"/>
-          <w:szCs w:val="22"/>
-          <w:lang w:val="en-US"/>
-        </w:rPr>
-        <w:t>Sorted correctly: True</w:t>
+        </w:rPr>
+      </w:pPr>
+      <w:proofErr w:type="spellStart"/>
+      <w:r>
+        <w:rPr>
+          <w:rFonts w:ascii="Courier New" w:hAnsi="Courier New" w:cs="Courier New"/>
+          <w:sz w:val="22"/>
+          <w:szCs w:val="22"/>
+        </w:rPr>
+        <w:t>Sorted</w:t>
+      </w:r>
+      <w:proofErr w:type="spellEnd"/>
+      <w:r>
+        <w:rPr>
+          <w:rFonts w:ascii="Courier New" w:hAnsi="Courier New" w:cs="Courier New"/>
+          <w:sz w:val="22"/>
+          <w:szCs w:val="22"/>
+        </w:rPr>
+        <w:t xml:space="preserve"> </w:t>
+      </w:r>
+      <w:proofErr w:type="spellStart"/>
+      <w:r>
+        <w:rPr>
+          <w:rFonts w:ascii="Courier New" w:hAnsi="Courier New" w:cs="Courier New"/>
+          <w:sz w:val="22"/>
+          <w:szCs w:val="22"/>
+        </w:rPr>
+        <w:t>correctly</w:t>
+      </w:r>
+      <w:proofErr w:type="spellEnd"/>
+      <w:r>
+        <w:rPr>
+          <w:rFonts w:ascii="Courier New" w:hAnsi="Courier New" w:cs="Courier New"/>
+          <w:sz w:val="22"/>
+          <w:szCs w:val="22"/>
+        </w:rPr>
+        <w:t>: True</w:t>
       </w:r>
     </w:p>
     <w:p>
@@ -2588,19 +2545,7 @@
           <w:rPr>
             <w:rFonts w:ascii="Cambria Math" w:eastAsiaTheme="minorEastAsia" w:hAnsi="Cambria Math"/>
           </w:rPr>
-          <m:t>n</m:t>
-        </m:r>
-        <m:r>
-          <w:rPr>
-            <w:rFonts w:ascii="Cambria Math" w:eastAsiaTheme="minorEastAsia" w:hAnsi="Cambria Math"/>
-          </w:rPr>
-          <m:t>+</m:t>
-        </m:r>
-        <m:r>
-          <w:rPr>
-            <w:rFonts w:ascii="Cambria Math" w:eastAsiaTheme="minorEastAsia" w:hAnsi="Cambria Math"/>
-          </w:rPr>
-          <m:t>1</m:t>
+          <m:t>n+1</m:t>
         </m:r>
       </m:oMath>
       <w:r>
@@ -2669,13 +2614,7 @@
           <w:rPr>
             <w:rFonts w:ascii="Cambria Math" w:eastAsiaTheme="minorEastAsia" w:hAnsi="Cambria Math"/>
           </w:rPr>
-          <m:t>n</m:t>
-        </m:r>
-        <m:r>
-          <w:rPr>
-            <w:rFonts w:ascii="Cambria Math" w:eastAsiaTheme="minorEastAsia" w:hAnsi="Cambria Math"/>
-          </w:rPr>
-          <m:t>-1</m:t>
+          <m:t>n-1</m:t>
         </m:r>
       </m:oMath>
       <w:r>
@@ -2700,13 +2639,7 @@
           <w:rPr>
             <w:rFonts w:ascii="Cambria Math" w:eastAsiaTheme="minorEastAsia" w:hAnsi="Cambria Math"/>
           </w:rPr>
-          <m:t>n</m:t>
-        </m:r>
-        <m:r>
-          <w:rPr>
-            <w:rFonts w:ascii="Cambria Math" w:eastAsiaTheme="minorEastAsia" w:hAnsi="Cambria Math"/>
-          </w:rPr>
-          <m:t>-1</m:t>
+          <m:t>n-1</m:t>
         </m:r>
       </m:oMath>
       <w:r>
@@ -2723,13 +2656,7 @@
           <w:rPr>
             <w:rFonts w:ascii="Cambria Math" w:eastAsiaTheme="minorEastAsia" w:hAnsi="Cambria Math"/>
           </w:rPr>
-          <m:t>n</m:t>
-        </m:r>
-        <m:r>
-          <w:rPr>
-            <w:rFonts w:ascii="Cambria Math" w:eastAsiaTheme="minorEastAsia" w:hAnsi="Cambria Math"/>
-          </w:rPr>
-          <m:t xml:space="preserve">-1+1=n </m:t>
+          <m:t xml:space="preserve">n-1+1=n </m:t>
         </m:r>
       </m:oMath>
       <w:r>
@@ -2875,32 +2802,20 @@
         <w:rPr>
           <w:rFonts w:eastAsiaTheme="minorEastAsia"/>
         </w:rPr>
-        <w:t xml:space="preserve"> Vergleiche</w:t>
-      </w:r>
-      <w:r>
-        <w:rPr>
-          <w:rFonts w:eastAsiaTheme="minorEastAsia"/>
-        </w:rPr>
-        <w:t xml:space="preserve"> notwendig, um alle Elemente sortieren zu können.</w:t>
-      </w:r>
-    </w:p>
-    <w:p>
-      <w:pPr>
-        <w:rPr>
-          <w:rFonts w:eastAsiaTheme="minorEastAsia"/>
-        </w:rPr>
-      </w:pPr>
-      <w:r>
-        <w:rPr>
-          <w:rFonts w:eastAsiaTheme="minorEastAsia"/>
-        </w:rPr>
-        <w:t xml:space="preserve">Im Best Case </w:t>
-      </w:r>
-      <w:r>
-        <w:rPr>
-          <w:rFonts w:eastAsiaTheme="minorEastAsia"/>
-        </w:rPr>
-        <w:t xml:space="preserve">sind </w:t>
+        <w:t xml:space="preserve"> Vergleiche notwendig, um alle Elemente sortieren zu können.</w:t>
+      </w:r>
+    </w:p>
+    <w:p>
+      <w:pPr>
+        <w:rPr>
+          <w:rFonts w:eastAsiaTheme="minorEastAsia"/>
+        </w:rPr>
+      </w:pPr>
+      <w:r>
+        <w:rPr>
+          <w:rFonts w:eastAsiaTheme="minorEastAsia"/>
+        </w:rPr>
+        <w:t xml:space="preserve">Im Best Case sind </w:t>
       </w:r>
       <m:oMath>
         <m:f>
@@ -2936,13 +2851,7 @@
         <w:rPr>
           <w:rFonts w:eastAsiaTheme="minorEastAsia"/>
         </w:rPr>
-        <w:t xml:space="preserve"> Vergleiche</w:t>
-      </w:r>
-      <w:r>
-        <w:rPr>
-          <w:rFonts w:eastAsiaTheme="minorEastAsia"/>
-        </w:rPr>
-        <w:t xml:space="preserve"> ausreichend, </w:t>
+        <w:t xml:space="preserve"> Vergleiche ausreichend, </w:t>
       </w:r>
       <w:r>
         <w:rPr>

</xml_diff>